<commit_message>
Added all the traffic simulation scenarios
</commit_message>
<xml_diff>
--- a/Reports/Biweekly_GenAI_Log_Template.docx
+++ b/Reports/Biweekly_GenAI_Log_Template.docx
@@ -199,6 +199,9 @@
             <w:r>
               <w:t>Date: Week 1</w:t>
             </w:r>
+            <w:r>
+              <w:t>-2</w:t>
+            </w:r>
           </w:p>
         </w:tc>
       </w:tr>
@@ -293,6 +296,50 @@
               <w:t>• Summarize research papers and reference list.</w:t>
             </w:r>
           </w:p>
+          <w:p>
+            <w:pPr>
+              <w:numPr>
+                <w:ilvl w:val="0"/>
+                <w:numId w:val="10"/>
+              </w:numPr>
+              <w:spacing w:after="160" w:line="278" w:lineRule="auto"/>
+            </w:pPr>
+            <w:r>
+              <w:t>z</w:t>
+            </w:r>
+            <w:r>
+              <w:t xml:space="preserve">Explain Federated Learning in traffic management systems. </w:t>
+            </w:r>
+          </w:p>
+          <w:p>
+            <w:pPr>
+              <w:numPr>
+                <w:ilvl w:val="0"/>
+                <w:numId w:val="10"/>
+              </w:numPr>
+              <w:spacing w:after="160" w:line="278" w:lineRule="auto"/>
+            </w:pPr>
+            <w:r>
+              <w:t xml:space="preserve">Create a 10-week implementation plan. </w:t>
+            </w:r>
+          </w:p>
+          <w:p>
+            <w:pPr>
+              <w:numPr>
+                <w:ilvl w:val="0"/>
+                <w:numId w:val="10"/>
+              </w:numPr>
+              <w:spacing w:after="160" w:line="278" w:lineRule="auto"/>
+            </w:pPr>
+            <w:r>
+              <w:t xml:space="preserve">Explain SUMO and TraCI integration. </w:t>
+            </w:r>
+          </w:p>
+          <w:p>
+            <w:r>
+              <w:t>Generate architecture for decentralized traffic management</w:t>
+            </w:r>
+          </w:p>
         </w:tc>
       </w:tr>
       <w:tr>
@@ -340,6 +387,39 @@
               <w:t>The AI tool was useful for understanding project concepts, planning implementation phases, and organizing documentation. However, all technical recommendations and design decisions were manually reviewed and validated before inclusion in the project documentation.</w:t>
             </w:r>
           </w:p>
+          <w:p>
+            <w:r>
+              <w:t>The generated content provided useful conceptual understanding and accelerated the project planning process. However, all technical recommendations were independently reviewed and validated against official documentation and research literature before adoption.</w:t>
+            </w:r>
+          </w:p>
+          <w:p/>
+          <w:p/>
+          <w:p>
+            <w:pPr>
+              <w:rPr>
+                <w:b/>
+                <w:bCs/>
+              </w:rPr>
+            </w:pPr>
+            <w:r>
+              <w:rPr>
+                <w:b/>
+                <w:bCs/>
+              </w:rPr>
+              <w:t>Impact on Project</w:t>
+            </w:r>
+          </w:p>
+          <w:p>
+            <w:r>
+              <w:t>The tool significantly reduced the time required to understand unfamiliar technologies and helped establish a structured implementation strategy.</w:t>
+            </w:r>
+          </w:p>
+          <w:p>
+            <w:r>
+              <w:t>helped establish a structured implementation strategy.</w:t>
+            </w:r>
+          </w:p>
+          <w:p/>
         </w:tc>
       </w:tr>
     </w:tbl>
@@ -522,15 +602,7 @@
                 <w:i/>
                 <w:iCs/>
               </w:rPr>
-              <w:t xml:space="preserve">Please briefly describe the benefits and shortcomings of the interaction and how you have </w:t>
-            </w:r>
-            <w:r>
-              <w:rPr>
-                <w:i/>
-                <w:iCs/>
-              </w:rPr>
-              <w:lastRenderedPageBreak/>
-              <w:t>incorporated it into your project</w:t>
+              <w:t>Please briefly describe the benefits and shortcomings of the interaction and how you have incorporated it into your project</w:t>
             </w:r>
           </w:p>
         </w:tc>
@@ -772,6 +844,7 @@
                 <w:b/>
                 <w:bCs/>
               </w:rPr>
+              <w:lastRenderedPageBreak/>
               <w:t>GenAI Interaction Week 7-8</w:t>
             </w:r>
           </w:p>
@@ -1060,15 +1133,7 @@
                 <w:i/>
                 <w:iCs/>
               </w:rPr>
-              <w:t xml:space="preserve">. Please provide a link or details of </w:t>
-            </w:r>
-            <w:r>
-              <w:rPr>
-                <w:i/>
-                <w:iCs/>
-              </w:rPr>
-              <w:lastRenderedPageBreak/>
-              <w:t xml:space="preserve">the file uploaded to Loop </w:t>
+              <w:t xml:space="preserve">. Please provide a link or details of the file uploaded to Loop </w:t>
             </w:r>
           </w:p>
         </w:tc>
@@ -1307,6 +1372,155 @@
       </w:rPr>
     </w:lvl>
   </w:abstractNum>
+  <w:abstractNum w:abstractNumId="9" w15:restartNumberingAfterBreak="0">
+    <w:nsid w:val="51EA3CDD"/>
+    <w:multiLevelType w:val="multilevel"/>
+    <w:tmpl w:val="3AD09E60"/>
+    <w:lvl w:ilvl="0">
+      <w:start w:val="1"/>
+      <w:numFmt w:val="bullet"/>
+      <w:lvlText w:val=""/>
+      <w:lvlJc w:val="left"/>
+      <w:pPr>
+        <w:tabs>
+          <w:tab w:val="num" w:pos="720"/>
+        </w:tabs>
+        <w:ind w:left="720" w:hanging="360"/>
+      </w:pPr>
+      <w:rPr>
+        <w:rFonts w:ascii="Symbol" w:hAnsi="Symbol" w:hint="default"/>
+        <w:sz w:val="20"/>
+      </w:rPr>
+    </w:lvl>
+    <w:lvl w:ilvl="1" w:tentative="1">
+      <w:start w:val="1"/>
+      <w:numFmt w:val="bullet"/>
+      <w:lvlText w:val="o"/>
+      <w:lvlJc w:val="left"/>
+      <w:pPr>
+        <w:tabs>
+          <w:tab w:val="num" w:pos="1440"/>
+        </w:tabs>
+        <w:ind w:left="1440" w:hanging="360"/>
+      </w:pPr>
+      <w:rPr>
+        <w:rFonts w:ascii="Courier New" w:hAnsi="Courier New" w:hint="default"/>
+        <w:sz w:val="20"/>
+      </w:rPr>
+    </w:lvl>
+    <w:lvl w:ilvl="2" w:tentative="1">
+      <w:start w:val="1"/>
+      <w:numFmt w:val="bullet"/>
+      <w:lvlText w:val=""/>
+      <w:lvlJc w:val="left"/>
+      <w:pPr>
+        <w:tabs>
+          <w:tab w:val="num" w:pos="2160"/>
+        </w:tabs>
+        <w:ind w:left="2160" w:hanging="360"/>
+      </w:pPr>
+      <w:rPr>
+        <w:rFonts w:ascii="Wingdings" w:hAnsi="Wingdings" w:hint="default"/>
+        <w:sz w:val="20"/>
+      </w:rPr>
+    </w:lvl>
+    <w:lvl w:ilvl="3" w:tentative="1">
+      <w:start w:val="1"/>
+      <w:numFmt w:val="bullet"/>
+      <w:lvlText w:val=""/>
+      <w:lvlJc w:val="left"/>
+      <w:pPr>
+        <w:tabs>
+          <w:tab w:val="num" w:pos="2880"/>
+        </w:tabs>
+        <w:ind w:left="2880" w:hanging="360"/>
+      </w:pPr>
+      <w:rPr>
+        <w:rFonts w:ascii="Wingdings" w:hAnsi="Wingdings" w:hint="default"/>
+        <w:sz w:val="20"/>
+      </w:rPr>
+    </w:lvl>
+    <w:lvl w:ilvl="4" w:tentative="1">
+      <w:start w:val="1"/>
+      <w:numFmt w:val="bullet"/>
+      <w:lvlText w:val=""/>
+      <w:lvlJc w:val="left"/>
+      <w:pPr>
+        <w:tabs>
+          <w:tab w:val="num" w:pos="3600"/>
+        </w:tabs>
+        <w:ind w:left="3600" w:hanging="360"/>
+      </w:pPr>
+      <w:rPr>
+        <w:rFonts w:ascii="Wingdings" w:hAnsi="Wingdings" w:hint="default"/>
+        <w:sz w:val="20"/>
+      </w:rPr>
+    </w:lvl>
+    <w:lvl w:ilvl="5" w:tentative="1">
+      <w:start w:val="1"/>
+      <w:numFmt w:val="bullet"/>
+      <w:lvlText w:val=""/>
+      <w:lvlJc w:val="left"/>
+      <w:pPr>
+        <w:tabs>
+          <w:tab w:val="num" w:pos="4320"/>
+        </w:tabs>
+        <w:ind w:left="4320" w:hanging="360"/>
+      </w:pPr>
+      <w:rPr>
+        <w:rFonts w:ascii="Wingdings" w:hAnsi="Wingdings" w:hint="default"/>
+        <w:sz w:val="20"/>
+      </w:rPr>
+    </w:lvl>
+    <w:lvl w:ilvl="6" w:tentative="1">
+      <w:start w:val="1"/>
+      <w:numFmt w:val="bullet"/>
+      <w:lvlText w:val=""/>
+      <w:lvlJc w:val="left"/>
+      <w:pPr>
+        <w:tabs>
+          <w:tab w:val="num" w:pos="5040"/>
+        </w:tabs>
+        <w:ind w:left="5040" w:hanging="360"/>
+      </w:pPr>
+      <w:rPr>
+        <w:rFonts w:ascii="Wingdings" w:hAnsi="Wingdings" w:hint="default"/>
+        <w:sz w:val="20"/>
+      </w:rPr>
+    </w:lvl>
+    <w:lvl w:ilvl="7" w:tentative="1">
+      <w:start w:val="1"/>
+      <w:numFmt w:val="bullet"/>
+      <w:lvlText w:val=""/>
+      <w:lvlJc w:val="left"/>
+      <w:pPr>
+        <w:tabs>
+          <w:tab w:val="num" w:pos="5760"/>
+        </w:tabs>
+        <w:ind w:left="5760" w:hanging="360"/>
+      </w:pPr>
+      <w:rPr>
+        <w:rFonts w:ascii="Wingdings" w:hAnsi="Wingdings" w:hint="default"/>
+        <w:sz w:val="20"/>
+      </w:rPr>
+    </w:lvl>
+    <w:lvl w:ilvl="8" w:tentative="1">
+      <w:start w:val="1"/>
+      <w:numFmt w:val="bullet"/>
+      <w:lvlText w:val=""/>
+      <w:lvlJc w:val="left"/>
+      <w:pPr>
+        <w:tabs>
+          <w:tab w:val="num" w:pos="6480"/>
+        </w:tabs>
+        <w:ind w:left="6480" w:hanging="360"/>
+      </w:pPr>
+      <w:rPr>
+        <w:rFonts w:ascii="Wingdings" w:hAnsi="Wingdings" w:hint="default"/>
+        <w:sz w:val="20"/>
+      </w:rPr>
+    </w:lvl>
+  </w:abstractNum>
   <w:num w:numId="1" w16cid:durableId="258149245">
     <w:abstractNumId w:val="8"/>
   </w:num>
@@ -1333,6 +1547,9 @@
   </w:num>
   <w:num w:numId="9" w16cid:durableId="2020698108">
     <w:abstractNumId w:val="0"/>
+  </w:num>
+  <w:num w:numId="10" w16cid:durableId="759716956">
+    <w:abstractNumId w:val="9"/>
   </w:num>
 </w:numbering>
 </file>

</xml_diff>